<commit_message>
clean and rename for submission
</commit_message>
<xml_diff>
--- a/third_review/cover letter 3rd review.docx
+++ b/third_review/cover letter 3rd review.docx
@@ -26,7 +26,25 @@
         <w:rPr>
           <w:lang w:val="en-US"/>
         </w:rPr>
-        <w:t xml:space="preserve">Dear Dr Radhika Khosla and </w:t>
+        <w:t>Dear Dr Radhika Khosla</w:t>
+      </w:r>
+      <w:r>
+        <w:rPr>
+          <w:lang w:val="en-US"/>
+        </w:rPr>
+        <w:t xml:space="preserve">, </w:t>
+      </w:r>
+      <w:r>
+        <w:rPr>
+          <w:lang w:val="en-US"/>
+        </w:rPr>
+        <w:t>Bethany Cosham</w:t>
+      </w:r>
+      <w:r>
+        <w:rPr>
+          <w:lang w:val="en-US"/>
+        </w:rPr>
+        <w:t xml:space="preserve"> and </w:t>
       </w:r>
       <w:r>
         <w:rPr>
@@ -63,7 +81,19 @@
         <w:rPr>
           <w:lang w:val="en-US"/>
         </w:rPr>
-        <w:t xml:space="preserve">Please find attached the revised version of our manuscript, </w:t>
+        <w:t xml:space="preserve">Please find attached the revised version of </w:t>
+      </w:r>
+      <w:r>
+        <w:rPr>
+          <w:lang w:val="en-US"/>
+        </w:rPr>
+        <w:t>my</w:t>
+      </w:r>
+      <w:r>
+        <w:rPr>
+          <w:lang w:val="en-US"/>
+        </w:rPr>
+        <w:t xml:space="preserve"> manuscript, </w:t>
       </w:r>
       <w:r>
         <w:rPr>
@@ -149,7 +179,35 @@
         <w:rPr>
           <w:lang w:val="en-US"/>
         </w:rPr>
-        <w:t xml:space="preserve"> also revised the treatment of the GHSL-WorldPop comparison. The manuscript and Figure 3 now state explicitly that, for the inside-PA perimeter, WorldPop estimates are systematically higher than GHSL estimates, whereas agreement is much closer for the broader inside-or-within-10-km perimeter. This asymmetry is now discussed in the text.</w:t>
+        <w:t xml:space="preserve"> also revised the treatment of the GHSL-</w:t>
+      </w:r>
+      <w:proofErr w:type="spellStart"/>
+      <w:r>
+        <w:rPr>
+          <w:lang w:val="en-US"/>
+        </w:rPr>
+        <w:t>WorldPop</w:t>
+      </w:r>
+      <w:proofErr w:type="spellEnd"/>
+      <w:r>
+        <w:rPr>
+          <w:lang w:val="en-US"/>
+        </w:rPr>
+        <w:t xml:space="preserve"> comparison. The manuscript and Figure 3 now state explicitly that, for the inside-PA perimeter, </w:t>
+      </w:r>
+      <w:proofErr w:type="spellStart"/>
+      <w:r>
+        <w:rPr>
+          <w:lang w:val="en-US"/>
+        </w:rPr>
+        <w:t>WorldPop</w:t>
+      </w:r>
+      <w:proofErr w:type="spellEnd"/>
+      <w:r>
+        <w:rPr>
+          <w:lang w:val="en-US"/>
+        </w:rPr>
+        <w:t xml:space="preserve"> estimates are systematically higher than GHSL estimates, whereas agreement is much closer for the broader inside-or-within-10-km perimeter. This asymmetry is now discussed in the text.</w:t>
       </w:r>
     </w:p>
     <w:p>
@@ -224,25 +282,85 @@
         <w:rPr>
           <w:lang w:val="en-US"/>
         </w:rPr>
-        <w:t xml:space="preserve">Thank you for considering </w:t>
-      </w:r>
-      <w:r>
-        <w:rPr>
-          <w:lang w:val="en-US"/>
-        </w:rPr>
-        <w:t>this</w:t>
-      </w:r>
-      <w:r>
-        <w:rPr>
-          <w:lang w:val="en-US"/>
-        </w:rPr>
-        <w:t xml:space="preserve"> revised manuscript.</w:t>
+        <w:t xml:space="preserve">The revised main text is now 4,398 words, which is </w:t>
+      </w:r>
+      <w:r>
+        <w:rPr>
+          <w:lang w:val="en-US"/>
+        </w:rPr>
+        <w:t xml:space="preserve">slightly </w:t>
+      </w:r>
+      <w:r>
+        <w:rPr>
+          <w:lang w:val="en-US"/>
+        </w:rPr>
+        <w:t xml:space="preserve">above the journal’s limit. I considered this </w:t>
+      </w:r>
+      <w:r>
+        <w:rPr>
+          <w:lang w:val="en-US"/>
+        </w:rPr>
+        <w:t>small</w:t>
+      </w:r>
+      <w:r>
+        <w:rPr>
+          <w:lang w:val="en-US"/>
+        </w:rPr>
+        <w:t xml:space="preserve"> excess warranted in order to address the successive reviewer comments while retaining the methodological explanations and additional results requested during the review process. I would</w:t>
+      </w:r>
+      <w:r>
+        <w:rPr>
+          <w:lang w:val="en-US"/>
+        </w:rPr>
+        <w:t xml:space="preserve"> </w:t>
+      </w:r>
+      <w:r>
+        <w:rPr>
+          <w:lang w:val="en-US"/>
+        </w:rPr>
+        <w:t xml:space="preserve">shorten the manuscript further should the editors </w:t>
+      </w:r>
+      <w:r>
+        <w:rPr>
+          <w:lang w:val="en-US"/>
+        </w:rPr>
+        <w:t>request it.</w:t>
       </w:r>
     </w:p>
     <w:p>
-      <w:r>
-        <w:t>Florent Bédécarrats</w:t>
-      </w:r>
+      <w:pPr>
+        <w:rPr>
+          <w:lang w:val="en-US"/>
+        </w:rPr>
+      </w:pPr>
+      <w:r>
+        <w:rPr>
+          <w:lang w:val="en-US"/>
+        </w:rPr>
+        <w:t xml:space="preserve">Thank you for considering </w:t>
+      </w:r>
+      <w:r>
+        <w:rPr>
+          <w:lang w:val="en-US"/>
+        </w:rPr>
+        <w:t>this</w:t>
+      </w:r>
+      <w:r>
+        <w:rPr>
+          <w:lang w:val="en-US"/>
+        </w:rPr>
+        <w:t xml:space="preserve"> revised manuscript.</w:t>
+      </w:r>
+    </w:p>
+    <w:p>
+      <w:r>
+        <w:t xml:space="preserve">Florent </w:t>
+      </w:r>
+      <w:proofErr w:type="spellStart"/>
+      <w:r>
+        <w:t>Bédécarrats</w:t>
+      </w:r>
+      <w:proofErr w:type="spellEnd"/>
     </w:p>
     <w:sectPr>
       <w:pgSz w:w="11906" w:h="16838"/>

</xml_diff>